<commit_message>
feat: enhance UIDocGenerator with Word preview functionality and improve open questions structure
</commit_message>
<xml_diff>
--- a/frontend/config/srs-template.example.docx
+++ b/frontend/config/srs-template.example.docx
@@ -1221,6 +1221,29 @@
           <w:szCs w:val="20"/>
         </w:rPr>
         <w:t xml:space="preserve">Đối tượng người dùng: [[accessRoles]]</w:t>
+      </w:r>
+    </w:p>
+    <w:p>
+      <w:pPr>
+        <w:pStyle w:val="ListParagraph"/>
+        <w:numPr>
+          <w:ilvl w:val="0"/>
+          <w:numId w:val="2"/>
+        </w:numPr>
+        <w:spacing w:after="60" w:before="60"/>
+      </w:pPr>
+      <w:r>
+        <w:rPr>
+          <w:rFonts w:ascii="Arial" w:cs="Arial" w:eastAsia="Arial" w:hAnsi="Arial"/>
+          <w:b w:val="false"/>
+          <w:bCs w:val="false"/>
+          <w:i w:val="false"/>
+          <w:iCs w:val="false"/>
+          <w:color w:val="1A1A1A"/>
+          <w:sz w:val="20"/>
+          <w:szCs w:val="20"/>
+        </w:rPr>
+        <w:t xml:space="preserve">[[FOR s IN scope]][[$s]][[END-FOR s]]</w:t>
       </w:r>
     </w:p>
     <w:p>

</xml_diff>

<commit_message>
feat: update docx template structure for improved data rendering and placeholder handling
</commit_message>
<xml_diff>
--- a/frontend/config/srs-template.example.docx
+++ b/frontend/config/srs-template.example.docx
@@ -1243,7 +1243,53 @@
           <w:sz w:val="20"/>
           <w:szCs w:val="20"/>
         </w:rPr>
-        <w:t xml:space="preserve">[[FOR s IN scope]][[$s]][[END-FOR s]]</w:t>
+        <w:t xml:space="preserve">[[FOR s IN scope]]</w:t>
+      </w:r>
+    </w:p>
+    <w:p>
+      <w:pPr>
+        <w:pStyle w:val="ListParagraph"/>
+        <w:numPr>
+          <w:ilvl w:val="0"/>
+          <w:numId w:val="2"/>
+        </w:numPr>
+        <w:spacing w:after="60" w:before="60"/>
+      </w:pPr>
+      <w:r>
+        <w:rPr>
+          <w:rFonts w:ascii="Arial" w:cs="Arial" w:eastAsia="Arial" w:hAnsi="Arial"/>
+          <w:b w:val="false"/>
+          <w:bCs w:val="false"/>
+          <w:i w:val="false"/>
+          <w:iCs w:val="false"/>
+          <w:color w:val="1A1A1A"/>
+          <w:sz w:val="20"/>
+          <w:szCs w:val="20"/>
+        </w:rPr>
+        <w:t xml:space="preserve">[[$s]]</w:t>
+      </w:r>
+    </w:p>
+    <w:p>
+      <w:pPr>
+        <w:pStyle w:val="ListParagraph"/>
+        <w:numPr>
+          <w:ilvl w:val="0"/>
+          <w:numId w:val="2"/>
+        </w:numPr>
+        <w:spacing w:after="60" w:before="60"/>
+      </w:pPr>
+      <w:r>
+        <w:rPr>
+          <w:rFonts w:ascii="Arial" w:cs="Arial" w:eastAsia="Arial" w:hAnsi="Arial"/>
+          <w:b w:val="false"/>
+          <w:bCs w:val="false"/>
+          <w:i w:val="false"/>
+          <w:iCs w:val="false"/>
+          <w:color w:val="1A1A1A"/>
+          <w:sz w:val="20"/>
+          <w:szCs w:val="20"/>
+        </w:rPr>
+        <w:t xml:space="preserve">[[END-FOR s]]</w:t>
       </w:r>
     </w:p>
     <w:p>
@@ -2262,7 +2308,7 @@
                 <w:sz w:val="20"/>
                 <w:szCs w:val="20"/>
               </w:rPr>
-              <w:t xml:space="preserve">[[IF hasImage]][[IMAGE mockup()]][[END-IF]]</w:t>
+              <w:t xml:space="preserve">[[IMAGE mockup()]]</w:t>
             </w:r>
           </w:p>
         </w:tc>
@@ -2624,7 +2670,7 @@
                 <w:sz w:val="20"/>
                 <w:szCs w:val="20"/>
               </w:rPr>
-              <w:t xml:space="preserve">[[FOR c IN components]][[$c.stt]]</w:t>
+              <w:t xml:space="preserve">[[FOR c IN components]]</w:t>
             </w:r>
           </w:p>
         </w:tc>
@@ -2662,6 +2708,236 @@
                 <w:sz w:val="20"/>
                 <w:szCs w:val="20"/>
               </w:rPr>
+              <w:t xml:space="preserve"/>
+            </w:r>
+          </w:p>
+        </w:tc>
+        <w:tc>
+          <w:tcPr>
+            <w:tcW w:type="dxa" w:w="1100"/>
+            <w:tcBorders>
+              <w:top w:val="single" w:color="BDD7EE" w:sz="4"/>
+              <w:left w:val="single" w:color="BDD7EE" w:sz="4"/>
+              <w:bottom w:val="single" w:color="BDD7EE" w:sz="4"/>
+              <w:right w:val="single" w:color="BDD7EE" w:sz="4"/>
+            </w:tcBorders>
+            <w:shd w:fill="F5FAFF" w:val="clear"/>
+            <w:tcMar>
+              <w:top w:type="dxa" w:w="100"/>
+              <w:left w:type="dxa" w:w="140"/>
+              <w:bottom w:type="dxa" w:w="100"/>
+              <w:right w:type="dxa" w:w="140"/>
+            </w:tcMar>
+            <w:vAlign w:val="top"/>
+          </w:tcPr>
+          <w:p>
+            <w:pPr>
+              <w:spacing w:after="80" w:before="80"/>
+              <w:jc w:val="left"/>
+            </w:pPr>
+            <w:r>
+              <w:rPr>
+                <w:rFonts w:ascii="Arial" w:cs="Arial" w:eastAsia="Arial" w:hAnsi="Arial"/>
+                <w:b w:val="false"/>
+                <w:bCs w:val="false"/>
+                <w:i w:val="false"/>
+                <w:iCs w:val="false"/>
+                <w:color w:val="1A1A1A"/>
+                <w:sz w:val="20"/>
+                <w:szCs w:val="20"/>
+              </w:rPr>
+              <w:t xml:space="preserve"/>
+            </w:r>
+          </w:p>
+        </w:tc>
+        <w:tc>
+          <w:tcPr>
+            <w:tcW w:type="dxa" w:w="900"/>
+            <w:tcBorders>
+              <w:top w:val="single" w:color="BDD7EE" w:sz="4"/>
+              <w:left w:val="single" w:color="BDD7EE" w:sz="4"/>
+              <w:bottom w:val="single" w:color="BDD7EE" w:sz="4"/>
+              <w:right w:val="single" w:color="BDD7EE" w:sz="4"/>
+            </w:tcBorders>
+            <w:shd w:fill="F5FAFF" w:val="clear"/>
+            <w:tcMar>
+              <w:top w:type="dxa" w:w="100"/>
+              <w:left w:type="dxa" w:w="140"/>
+              <w:bottom w:type="dxa" w:w="100"/>
+              <w:right w:type="dxa" w:w="140"/>
+            </w:tcMar>
+            <w:vAlign w:val="center"/>
+          </w:tcPr>
+          <w:p>
+            <w:pPr>
+              <w:spacing w:after="80" w:before="80"/>
+              <w:jc w:val="center"/>
+            </w:pPr>
+            <w:r>
+              <w:rPr>
+                <w:rFonts w:ascii="Arial" w:cs="Arial" w:eastAsia="Arial" w:hAnsi="Arial"/>
+                <w:b w:val="false"/>
+                <w:bCs w:val="false"/>
+                <w:i w:val="false"/>
+                <w:iCs w:val="false"/>
+                <w:color w:val="1A1A1A"/>
+                <w:sz w:val="20"/>
+                <w:szCs w:val="20"/>
+              </w:rPr>
+              <w:t xml:space="preserve"/>
+            </w:r>
+          </w:p>
+        </w:tc>
+        <w:tc>
+          <w:tcPr>
+            <w:tcW w:type="dxa" w:w="2560"/>
+            <w:tcBorders>
+              <w:top w:val="single" w:color="BDD7EE" w:sz="4"/>
+              <w:left w:val="single" w:color="BDD7EE" w:sz="4"/>
+              <w:bottom w:val="single" w:color="BDD7EE" w:sz="4"/>
+              <w:right w:val="single" w:color="BDD7EE" w:sz="4"/>
+            </w:tcBorders>
+            <w:shd w:fill="F5FAFF" w:val="clear"/>
+            <w:tcMar>
+              <w:top w:type="dxa" w:w="100"/>
+              <w:left w:type="dxa" w:w="140"/>
+              <w:bottom w:type="dxa" w:w="100"/>
+              <w:right w:type="dxa" w:w="140"/>
+            </w:tcMar>
+            <w:vAlign w:val="top"/>
+          </w:tcPr>
+          <w:p>
+            <w:pPr>
+              <w:spacing w:after="80" w:before="80"/>
+              <w:jc w:val="left"/>
+            </w:pPr>
+            <w:r>
+              <w:rPr>
+                <w:rFonts w:ascii="Arial" w:cs="Arial" w:eastAsia="Arial" w:hAnsi="Arial"/>
+                <w:b w:val="false"/>
+                <w:bCs w:val="false"/>
+                <w:i w:val="false"/>
+                <w:iCs w:val="false"/>
+                <w:color w:val="1A1A1A"/>
+                <w:sz w:val="20"/>
+                <w:szCs w:val="20"/>
+              </w:rPr>
+              <w:t xml:space="preserve"/>
+            </w:r>
+          </w:p>
+        </w:tc>
+        <w:tc>
+          <w:tcPr>
+            <w:tcW w:type="dxa" w:w="2700"/>
+            <w:tcBorders>
+              <w:top w:val="single" w:color="BDD7EE" w:sz="4"/>
+              <w:left w:val="single" w:color="BDD7EE" w:sz="4"/>
+              <w:bottom w:val="single" w:color="BDD7EE" w:sz="4"/>
+              <w:right w:val="single" w:color="BDD7EE" w:sz="4"/>
+            </w:tcBorders>
+            <w:shd w:fill="F5FAFF" w:val="clear"/>
+            <w:tcMar>
+              <w:top w:type="dxa" w:w="100"/>
+              <w:left w:type="dxa" w:w="140"/>
+              <w:bottom w:type="dxa" w:w="100"/>
+              <w:right w:type="dxa" w:w="140"/>
+            </w:tcMar>
+            <w:vAlign w:val="top"/>
+          </w:tcPr>
+          <w:p>
+            <w:pPr>
+              <w:spacing w:after="80" w:before="80"/>
+              <w:jc w:val="left"/>
+            </w:pPr>
+            <w:r>
+              <w:rPr>
+                <w:rFonts w:ascii="Arial" w:cs="Arial" w:eastAsia="Arial" w:hAnsi="Arial"/>
+                <w:b w:val="false"/>
+                <w:bCs w:val="false"/>
+                <w:i w:val="false"/>
+                <w:iCs w:val="false"/>
+                <w:color w:val="1A1A1A"/>
+                <w:sz w:val="20"/>
+                <w:szCs w:val="20"/>
+              </w:rPr>
+              <w:t xml:space="preserve"/>
+            </w:r>
+          </w:p>
+        </w:tc>
+      </w:tr>
+      <w:tr>
+        <w:tc>
+          <w:tcPr>
+            <w:tcW w:type="dxa" w:w="500"/>
+            <w:tcBorders>
+              <w:top w:val="single" w:color="BDD7EE" w:sz="4"/>
+              <w:left w:val="single" w:color="BDD7EE" w:sz="4"/>
+              <w:bottom w:val="single" w:color="BDD7EE" w:sz="4"/>
+              <w:right w:val="single" w:color="BDD7EE" w:sz="4"/>
+            </w:tcBorders>
+            <w:shd w:fill="F5FAFF" w:val="clear"/>
+            <w:tcMar>
+              <w:top w:type="dxa" w:w="100"/>
+              <w:left w:type="dxa" w:w="140"/>
+              <w:bottom w:type="dxa" w:w="100"/>
+              <w:right w:type="dxa" w:w="140"/>
+            </w:tcMar>
+            <w:vAlign w:val="top"/>
+          </w:tcPr>
+          <w:p>
+            <w:pPr>
+              <w:spacing w:after="80" w:before="80"/>
+              <w:jc w:val="left"/>
+            </w:pPr>
+            <w:r>
+              <w:rPr>
+                <w:rFonts w:ascii="Arial" w:cs="Arial" w:eastAsia="Arial" w:hAnsi="Arial"/>
+                <w:b w:val="false"/>
+                <w:bCs w:val="false"/>
+                <w:i w:val="false"/>
+                <w:iCs w:val="false"/>
+                <w:color w:val="1A1A1A"/>
+                <w:sz w:val="20"/>
+                <w:szCs w:val="20"/>
+              </w:rPr>
+              <w:t xml:space="preserve">[[$c.stt]]</w:t>
+            </w:r>
+          </w:p>
+        </w:tc>
+        <w:tc>
+          <w:tcPr>
+            <w:tcW w:type="dxa" w:w="1600"/>
+            <w:tcBorders>
+              <w:top w:val="single" w:color="BDD7EE" w:sz="4"/>
+              <w:left w:val="single" w:color="BDD7EE" w:sz="4"/>
+              <w:bottom w:val="single" w:color="BDD7EE" w:sz="4"/>
+              <w:right w:val="single" w:color="BDD7EE" w:sz="4"/>
+            </w:tcBorders>
+            <w:shd w:fill="F5FAFF" w:val="clear"/>
+            <w:tcMar>
+              <w:top w:type="dxa" w:w="100"/>
+              <w:left w:type="dxa" w:w="140"/>
+              <w:bottom w:type="dxa" w:w="100"/>
+              <w:right w:type="dxa" w:w="140"/>
+            </w:tcMar>
+            <w:vAlign w:val="top"/>
+          </w:tcPr>
+          <w:p>
+            <w:pPr>
+              <w:spacing w:after="80" w:before="80"/>
+              <w:jc w:val="left"/>
+            </w:pPr>
+            <w:r>
+              <w:rPr>
+                <w:rFonts w:ascii="Arial" w:cs="Arial" w:eastAsia="Arial" w:hAnsi="Arial"/>
+                <w:b w:val="false"/>
+                <w:bCs w:val="false"/>
+                <w:i w:val="false"/>
+                <w:iCs w:val="false"/>
+                <w:color w:val="1A1A1A"/>
+                <w:sz w:val="20"/>
+                <w:szCs w:val="20"/>
+              </w:rPr>
               <w:t xml:space="preserve">[[$c.name]]</w:t>
             </w:r>
           </w:p>
@@ -2814,7 +3090,237 @@
                 <w:sz w:val="20"/>
                 <w:szCs w:val="20"/>
               </w:rPr>
-              <w:t xml:space="preserve">[[$c.validation]][[END-FOR c]]</w:t>
+              <w:t xml:space="preserve">[[$c.validation]]</w:t>
+            </w:r>
+          </w:p>
+        </w:tc>
+      </w:tr>
+      <w:tr>
+        <w:tc>
+          <w:tcPr>
+            <w:tcW w:type="dxa" w:w="500"/>
+            <w:tcBorders>
+              <w:top w:val="single" w:color="BDD7EE" w:sz="4"/>
+              <w:left w:val="single" w:color="BDD7EE" w:sz="4"/>
+              <w:bottom w:val="single" w:color="BDD7EE" w:sz="4"/>
+              <w:right w:val="single" w:color="BDD7EE" w:sz="4"/>
+            </w:tcBorders>
+            <w:shd w:fill="F5FAFF" w:val="clear"/>
+            <w:tcMar>
+              <w:top w:type="dxa" w:w="100"/>
+              <w:left w:type="dxa" w:w="140"/>
+              <w:bottom w:type="dxa" w:w="100"/>
+              <w:right w:type="dxa" w:w="140"/>
+            </w:tcMar>
+            <w:vAlign w:val="top"/>
+          </w:tcPr>
+          <w:p>
+            <w:pPr>
+              <w:spacing w:after="80" w:before="80"/>
+              <w:jc w:val="left"/>
+            </w:pPr>
+            <w:r>
+              <w:rPr>
+                <w:rFonts w:ascii="Arial" w:cs="Arial" w:eastAsia="Arial" w:hAnsi="Arial"/>
+                <w:b w:val="false"/>
+                <w:bCs w:val="false"/>
+                <w:i w:val="false"/>
+                <w:iCs w:val="false"/>
+                <w:color w:val="1A1A1A"/>
+                <w:sz w:val="20"/>
+                <w:szCs w:val="20"/>
+              </w:rPr>
+              <w:t xml:space="preserve">[[END-FOR c]]</w:t>
+            </w:r>
+          </w:p>
+        </w:tc>
+        <w:tc>
+          <w:tcPr>
+            <w:tcW w:type="dxa" w:w="1600"/>
+            <w:tcBorders>
+              <w:top w:val="single" w:color="BDD7EE" w:sz="4"/>
+              <w:left w:val="single" w:color="BDD7EE" w:sz="4"/>
+              <w:bottom w:val="single" w:color="BDD7EE" w:sz="4"/>
+              <w:right w:val="single" w:color="BDD7EE" w:sz="4"/>
+            </w:tcBorders>
+            <w:shd w:fill="F5FAFF" w:val="clear"/>
+            <w:tcMar>
+              <w:top w:type="dxa" w:w="100"/>
+              <w:left w:type="dxa" w:w="140"/>
+              <w:bottom w:type="dxa" w:w="100"/>
+              <w:right w:type="dxa" w:w="140"/>
+            </w:tcMar>
+            <w:vAlign w:val="top"/>
+          </w:tcPr>
+          <w:p>
+            <w:pPr>
+              <w:spacing w:after="80" w:before="80"/>
+              <w:jc w:val="left"/>
+            </w:pPr>
+            <w:r>
+              <w:rPr>
+                <w:rFonts w:ascii="Arial" w:cs="Arial" w:eastAsia="Arial" w:hAnsi="Arial"/>
+                <w:b w:val="false"/>
+                <w:bCs w:val="false"/>
+                <w:i w:val="false"/>
+                <w:iCs w:val="false"/>
+                <w:color w:val="1A1A1A"/>
+                <w:sz w:val="20"/>
+                <w:szCs w:val="20"/>
+              </w:rPr>
+              <w:t xml:space="preserve"/>
+            </w:r>
+          </w:p>
+        </w:tc>
+        <w:tc>
+          <w:tcPr>
+            <w:tcW w:type="dxa" w:w="1100"/>
+            <w:tcBorders>
+              <w:top w:val="single" w:color="BDD7EE" w:sz="4"/>
+              <w:left w:val="single" w:color="BDD7EE" w:sz="4"/>
+              <w:bottom w:val="single" w:color="BDD7EE" w:sz="4"/>
+              <w:right w:val="single" w:color="BDD7EE" w:sz="4"/>
+            </w:tcBorders>
+            <w:shd w:fill="F5FAFF" w:val="clear"/>
+            <w:tcMar>
+              <w:top w:type="dxa" w:w="100"/>
+              <w:left w:type="dxa" w:w="140"/>
+              <w:bottom w:type="dxa" w:w="100"/>
+              <w:right w:type="dxa" w:w="140"/>
+            </w:tcMar>
+            <w:vAlign w:val="top"/>
+          </w:tcPr>
+          <w:p>
+            <w:pPr>
+              <w:spacing w:after="80" w:before="80"/>
+              <w:jc w:val="left"/>
+            </w:pPr>
+            <w:r>
+              <w:rPr>
+                <w:rFonts w:ascii="Arial" w:cs="Arial" w:eastAsia="Arial" w:hAnsi="Arial"/>
+                <w:b w:val="false"/>
+                <w:bCs w:val="false"/>
+                <w:i w:val="false"/>
+                <w:iCs w:val="false"/>
+                <w:color w:val="1A1A1A"/>
+                <w:sz w:val="20"/>
+                <w:szCs w:val="20"/>
+              </w:rPr>
+              <w:t xml:space="preserve"/>
+            </w:r>
+          </w:p>
+        </w:tc>
+        <w:tc>
+          <w:tcPr>
+            <w:tcW w:type="dxa" w:w="900"/>
+            <w:tcBorders>
+              <w:top w:val="single" w:color="BDD7EE" w:sz="4"/>
+              <w:left w:val="single" w:color="BDD7EE" w:sz="4"/>
+              <w:bottom w:val="single" w:color="BDD7EE" w:sz="4"/>
+              <w:right w:val="single" w:color="BDD7EE" w:sz="4"/>
+            </w:tcBorders>
+            <w:shd w:fill="F5FAFF" w:val="clear"/>
+            <w:tcMar>
+              <w:top w:type="dxa" w:w="100"/>
+              <w:left w:type="dxa" w:w="140"/>
+              <w:bottom w:type="dxa" w:w="100"/>
+              <w:right w:type="dxa" w:w="140"/>
+            </w:tcMar>
+            <w:vAlign w:val="center"/>
+          </w:tcPr>
+          <w:p>
+            <w:pPr>
+              <w:spacing w:after="80" w:before="80"/>
+              <w:jc w:val="center"/>
+            </w:pPr>
+            <w:r>
+              <w:rPr>
+                <w:rFonts w:ascii="Arial" w:cs="Arial" w:eastAsia="Arial" w:hAnsi="Arial"/>
+                <w:b w:val="false"/>
+                <w:bCs w:val="false"/>
+                <w:i w:val="false"/>
+                <w:iCs w:val="false"/>
+                <w:color w:val="1A1A1A"/>
+                <w:sz w:val="20"/>
+                <w:szCs w:val="20"/>
+              </w:rPr>
+              <w:t xml:space="preserve"/>
+            </w:r>
+          </w:p>
+        </w:tc>
+        <w:tc>
+          <w:tcPr>
+            <w:tcW w:type="dxa" w:w="2560"/>
+            <w:tcBorders>
+              <w:top w:val="single" w:color="BDD7EE" w:sz="4"/>
+              <w:left w:val="single" w:color="BDD7EE" w:sz="4"/>
+              <w:bottom w:val="single" w:color="BDD7EE" w:sz="4"/>
+              <w:right w:val="single" w:color="BDD7EE" w:sz="4"/>
+            </w:tcBorders>
+            <w:shd w:fill="F5FAFF" w:val="clear"/>
+            <w:tcMar>
+              <w:top w:type="dxa" w:w="100"/>
+              <w:left w:type="dxa" w:w="140"/>
+              <w:bottom w:type="dxa" w:w="100"/>
+              <w:right w:type="dxa" w:w="140"/>
+            </w:tcMar>
+            <w:vAlign w:val="top"/>
+          </w:tcPr>
+          <w:p>
+            <w:pPr>
+              <w:spacing w:after="80" w:before="80"/>
+              <w:jc w:val="left"/>
+            </w:pPr>
+            <w:r>
+              <w:rPr>
+                <w:rFonts w:ascii="Arial" w:cs="Arial" w:eastAsia="Arial" w:hAnsi="Arial"/>
+                <w:b w:val="false"/>
+                <w:bCs w:val="false"/>
+                <w:i w:val="false"/>
+                <w:iCs w:val="false"/>
+                <w:color w:val="1A1A1A"/>
+                <w:sz w:val="20"/>
+                <w:szCs w:val="20"/>
+              </w:rPr>
+              <w:t xml:space="preserve"/>
+            </w:r>
+          </w:p>
+        </w:tc>
+        <w:tc>
+          <w:tcPr>
+            <w:tcW w:type="dxa" w:w="2700"/>
+            <w:tcBorders>
+              <w:top w:val="single" w:color="BDD7EE" w:sz="4"/>
+              <w:left w:val="single" w:color="BDD7EE" w:sz="4"/>
+              <w:bottom w:val="single" w:color="BDD7EE" w:sz="4"/>
+              <w:right w:val="single" w:color="BDD7EE" w:sz="4"/>
+            </w:tcBorders>
+            <w:shd w:fill="F5FAFF" w:val="clear"/>
+            <w:tcMar>
+              <w:top w:type="dxa" w:w="100"/>
+              <w:left w:type="dxa" w:w="140"/>
+              <w:bottom w:type="dxa" w:w="100"/>
+              <w:right w:type="dxa" w:w="140"/>
+            </w:tcMar>
+            <w:vAlign w:val="top"/>
+          </w:tcPr>
+          <w:p>
+            <w:pPr>
+              <w:spacing w:after="80" w:before="80"/>
+              <w:jc w:val="left"/>
+            </w:pPr>
+            <w:r>
+              <w:rPr>
+                <w:rFonts w:ascii="Arial" w:cs="Arial" w:eastAsia="Arial" w:hAnsi="Arial"/>
+                <w:b w:val="false"/>
+                <w:bCs w:val="false"/>
+                <w:i w:val="false"/>
+                <w:iCs w:val="false"/>
+                <w:color w:val="1A1A1A"/>
+                <w:sz w:val="20"/>
+                <w:szCs w:val="20"/>
+              </w:rPr>
+              <w:t xml:space="preserve"/>
             </w:r>
           </w:p>
         </w:tc>
@@ -3147,7 +3653,7 @@
                 <w:sz w:val="20"/>
                 <w:szCs w:val="20"/>
               </w:rPr>
-              <w:t xml:space="preserve">[[FOR f IN flow]][[$f.step]]</w:t>
+              <w:t xml:space="preserve">[[FOR f IN flow]]</w:t>
             </w:r>
           </w:p>
         </w:tc>
@@ -3185,6 +3691,160 @@
                 <w:sz w:val="20"/>
                 <w:szCs w:val="20"/>
               </w:rPr>
+              <w:t xml:space="preserve"/>
+            </w:r>
+          </w:p>
+        </w:tc>
+        <w:tc>
+          <w:tcPr>
+            <w:tcW w:type="dxa" w:w="3200"/>
+            <w:tcBorders>
+              <w:top w:val="single" w:color="BDD7EE" w:sz="4"/>
+              <w:left w:val="single" w:color="BDD7EE" w:sz="4"/>
+              <w:bottom w:val="single" w:color="BDD7EE" w:sz="4"/>
+              <w:right w:val="single" w:color="BDD7EE" w:sz="4"/>
+            </w:tcBorders>
+            <w:shd w:fill="F5FAFF" w:val="clear"/>
+            <w:tcMar>
+              <w:top w:type="dxa" w:w="100"/>
+              <w:left w:type="dxa" w:w="140"/>
+              <w:bottom w:type="dxa" w:w="100"/>
+              <w:right w:type="dxa" w:w="140"/>
+            </w:tcMar>
+            <w:vAlign w:val="top"/>
+          </w:tcPr>
+          <w:p>
+            <w:pPr>
+              <w:spacing w:after="80" w:before="80"/>
+              <w:jc w:val="left"/>
+            </w:pPr>
+            <w:r>
+              <w:rPr>
+                <w:rFonts w:ascii="Arial" w:cs="Arial" w:eastAsia="Arial" w:hAnsi="Arial"/>
+                <w:b w:val="false"/>
+                <w:bCs w:val="false"/>
+                <w:i w:val="false"/>
+                <w:iCs w:val="false"/>
+                <w:color w:val="1A1A1A"/>
+                <w:sz w:val="20"/>
+                <w:szCs w:val="20"/>
+              </w:rPr>
+              <w:t xml:space="preserve"/>
+            </w:r>
+          </w:p>
+        </w:tc>
+        <w:tc>
+          <w:tcPr>
+            <w:tcW w:type="dxa" w:w="3560"/>
+            <w:tcBorders>
+              <w:top w:val="single" w:color="BDD7EE" w:sz="4"/>
+              <w:left w:val="single" w:color="BDD7EE" w:sz="4"/>
+              <w:bottom w:val="single" w:color="BDD7EE" w:sz="4"/>
+              <w:right w:val="single" w:color="BDD7EE" w:sz="4"/>
+            </w:tcBorders>
+            <w:shd w:fill="F5FAFF" w:val="clear"/>
+            <w:tcMar>
+              <w:top w:type="dxa" w:w="100"/>
+              <w:left w:type="dxa" w:w="140"/>
+              <w:bottom w:type="dxa" w:w="100"/>
+              <w:right w:type="dxa" w:w="140"/>
+            </w:tcMar>
+            <w:vAlign w:val="top"/>
+          </w:tcPr>
+          <w:p>
+            <w:pPr>
+              <w:spacing w:after="80" w:before="80"/>
+              <w:jc w:val="left"/>
+            </w:pPr>
+            <w:r>
+              <w:rPr>
+                <w:rFonts w:ascii="Arial" w:cs="Arial" w:eastAsia="Arial" w:hAnsi="Arial"/>
+                <w:b w:val="false"/>
+                <w:bCs w:val="false"/>
+                <w:i w:val="false"/>
+                <w:iCs w:val="false"/>
+                <w:color w:val="1A1A1A"/>
+                <w:sz w:val="20"/>
+                <w:szCs w:val="20"/>
+              </w:rPr>
+              <w:t xml:space="preserve"/>
+            </w:r>
+          </w:p>
+        </w:tc>
+      </w:tr>
+      <w:tr>
+        <w:tc>
+          <w:tcPr>
+            <w:tcW w:type="dxa" w:w="600"/>
+            <w:tcBorders>
+              <w:top w:val="single" w:color="BDD7EE" w:sz="4"/>
+              <w:left w:val="single" w:color="BDD7EE" w:sz="4"/>
+              <w:bottom w:val="single" w:color="BDD7EE" w:sz="4"/>
+              <w:right w:val="single" w:color="BDD7EE" w:sz="4"/>
+            </w:tcBorders>
+            <w:shd w:fill="F5FAFF" w:val="clear"/>
+            <w:tcMar>
+              <w:top w:type="dxa" w:w="100"/>
+              <w:left w:type="dxa" w:w="140"/>
+              <w:bottom w:type="dxa" w:w="100"/>
+              <w:right w:type="dxa" w:w="140"/>
+            </w:tcMar>
+            <w:vAlign w:val="top"/>
+          </w:tcPr>
+          <w:p>
+            <w:pPr>
+              <w:spacing w:after="80" w:before="80"/>
+              <w:jc w:val="left"/>
+            </w:pPr>
+            <w:r>
+              <w:rPr>
+                <w:rFonts w:ascii="Arial" w:cs="Arial" w:eastAsia="Arial" w:hAnsi="Arial"/>
+                <w:b w:val="false"/>
+                <w:bCs w:val="false"/>
+                <w:i w:val="false"/>
+                <w:iCs w:val="false"/>
+                <w:color w:val="1A1A1A"/>
+                <w:sz w:val="20"/>
+                <w:szCs w:val="20"/>
+              </w:rPr>
+              <w:t xml:space="preserve">[[$f.step]]</w:t>
+            </w:r>
+          </w:p>
+        </w:tc>
+        <w:tc>
+          <w:tcPr>
+            <w:tcW w:type="dxa" w:w="2000"/>
+            <w:tcBorders>
+              <w:top w:val="single" w:color="BDD7EE" w:sz="4"/>
+              <w:left w:val="single" w:color="BDD7EE" w:sz="4"/>
+              <w:bottom w:val="single" w:color="BDD7EE" w:sz="4"/>
+              <w:right w:val="single" w:color="BDD7EE" w:sz="4"/>
+            </w:tcBorders>
+            <w:shd w:fill="F5FAFF" w:val="clear"/>
+            <w:tcMar>
+              <w:top w:type="dxa" w:w="100"/>
+              <w:left w:type="dxa" w:w="140"/>
+              <w:bottom w:type="dxa" w:w="100"/>
+              <w:right w:type="dxa" w:w="140"/>
+            </w:tcMar>
+            <w:vAlign w:val="top"/>
+          </w:tcPr>
+          <w:p>
+            <w:pPr>
+              <w:spacing w:after="80" w:before="80"/>
+              <w:jc w:val="left"/>
+            </w:pPr>
+            <w:r>
+              <w:rPr>
+                <w:rFonts w:ascii="Arial" w:cs="Arial" w:eastAsia="Arial" w:hAnsi="Arial"/>
+                <w:b w:val="false"/>
+                <w:bCs w:val="false"/>
+                <w:i w:val="false"/>
+                <w:iCs w:val="false"/>
+                <w:color w:val="1A1A1A"/>
+                <w:sz w:val="20"/>
+                <w:szCs w:val="20"/>
+              </w:rPr>
               <w:t xml:space="preserve">[[$f.actor]]</w:t>
             </w:r>
           </w:p>
@@ -3261,7 +3921,161 @@
                 <w:sz w:val="20"/>
                 <w:szCs w:val="20"/>
               </w:rPr>
-              <w:t xml:space="preserve">[[$f.result]][[END-FOR f]]</w:t>
+              <w:t xml:space="preserve">[[$f.result]]</w:t>
+            </w:r>
+          </w:p>
+        </w:tc>
+      </w:tr>
+      <w:tr>
+        <w:tc>
+          <w:tcPr>
+            <w:tcW w:type="dxa" w:w="600"/>
+            <w:tcBorders>
+              <w:top w:val="single" w:color="BDD7EE" w:sz="4"/>
+              <w:left w:val="single" w:color="BDD7EE" w:sz="4"/>
+              <w:bottom w:val="single" w:color="BDD7EE" w:sz="4"/>
+              <w:right w:val="single" w:color="BDD7EE" w:sz="4"/>
+            </w:tcBorders>
+            <w:shd w:fill="F5FAFF" w:val="clear"/>
+            <w:tcMar>
+              <w:top w:type="dxa" w:w="100"/>
+              <w:left w:type="dxa" w:w="140"/>
+              <w:bottom w:type="dxa" w:w="100"/>
+              <w:right w:type="dxa" w:w="140"/>
+            </w:tcMar>
+            <w:vAlign w:val="top"/>
+          </w:tcPr>
+          <w:p>
+            <w:pPr>
+              <w:spacing w:after="80" w:before="80"/>
+              <w:jc w:val="left"/>
+            </w:pPr>
+            <w:r>
+              <w:rPr>
+                <w:rFonts w:ascii="Arial" w:cs="Arial" w:eastAsia="Arial" w:hAnsi="Arial"/>
+                <w:b w:val="false"/>
+                <w:bCs w:val="false"/>
+                <w:i w:val="false"/>
+                <w:iCs w:val="false"/>
+                <w:color w:val="1A1A1A"/>
+                <w:sz w:val="20"/>
+                <w:szCs w:val="20"/>
+              </w:rPr>
+              <w:t xml:space="preserve">[[END-FOR f]]</w:t>
+            </w:r>
+          </w:p>
+        </w:tc>
+        <w:tc>
+          <w:tcPr>
+            <w:tcW w:type="dxa" w:w="2000"/>
+            <w:tcBorders>
+              <w:top w:val="single" w:color="BDD7EE" w:sz="4"/>
+              <w:left w:val="single" w:color="BDD7EE" w:sz="4"/>
+              <w:bottom w:val="single" w:color="BDD7EE" w:sz="4"/>
+              <w:right w:val="single" w:color="BDD7EE" w:sz="4"/>
+            </w:tcBorders>
+            <w:shd w:fill="F5FAFF" w:val="clear"/>
+            <w:tcMar>
+              <w:top w:type="dxa" w:w="100"/>
+              <w:left w:type="dxa" w:w="140"/>
+              <w:bottom w:type="dxa" w:w="100"/>
+              <w:right w:type="dxa" w:w="140"/>
+            </w:tcMar>
+            <w:vAlign w:val="top"/>
+          </w:tcPr>
+          <w:p>
+            <w:pPr>
+              <w:spacing w:after="80" w:before="80"/>
+              <w:jc w:val="left"/>
+            </w:pPr>
+            <w:r>
+              <w:rPr>
+                <w:rFonts w:ascii="Arial" w:cs="Arial" w:eastAsia="Arial" w:hAnsi="Arial"/>
+                <w:b w:val="false"/>
+                <w:bCs w:val="false"/>
+                <w:i w:val="false"/>
+                <w:iCs w:val="false"/>
+                <w:color w:val="1A1A1A"/>
+                <w:sz w:val="20"/>
+                <w:szCs w:val="20"/>
+              </w:rPr>
+              <w:t xml:space="preserve"/>
+            </w:r>
+          </w:p>
+        </w:tc>
+        <w:tc>
+          <w:tcPr>
+            <w:tcW w:type="dxa" w:w="3200"/>
+            <w:tcBorders>
+              <w:top w:val="single" w:color="BDD7EE" w:sz="4"/>
+              <w:left w:val="single" w:color="BDD7EE" w:sz="4"/>
+              <w:bottom w:val="single" w:color="BDD7EE" w:sz="4"/>
+              <w:right w:val="single" w:color="BDD7EE" w:sz="4"/>
+            </w:tcBorders>
+            <w:shd w:fill="F5FAFF" w:val="clear"/>
+            <w:tcMar>
+              <w:top w:type="dxa" w:w="100"/>
+              <w:left w:type="dxa" w:w="140"/>
+              <w:bottom w:type="dxa" w:w="100"/>
+              <w:right w:type="dxa" w:w="140"/>
+            </w:tcMar>
+            <w:vAlign w:val="top"/>
+          </w:tcPr>
+          <w:p>
+            <w:pPr>
+              <w:spacing w:after="80" w:before="80"/>
+              <w:jc w:val="left"/>
+            </w:pPr>
+            <w:r>
+              <w:rPr>
+                <w:rFonts w:ascii="Arial" w:cs="Arial" w:eastAsia="Arial" w:hAnsi="Arial"/>
+                <w:b w:val="false"/>
+                <w:bCs w:val="false"/>
+                <w:i w:val="false"/>
+                <w:iCs w:val="false"/>
+                <w:color w:val="1A1A1A"/>
+                <w:sz w:val="20"/>
+                <w:szCs w:val="20"/>
+              </w:rPr>
+              <w:t xml:space="preserve"/>
+            </w:r>
+          </w:p>
+        </w:tc>
+        <w:tc>
+          <w:tcPr>
+            <w:tcW w:type="dxa" w:w="3560"/>
+            <w:tcBorders>
+              <w:top w:val="single" w:color="BDD7EE" w:sz="4"/>
+              <w:left w:val="single" w:color="BDD7EE" w:sz="4"/>
+              <w:bottom w:val="single" w:color="BDD7EE" w:sz="4"/>
+              <w:right w:val="single" w:color="BDD7EE" w:sz="4"/>
+            </w:tcBorders>
+            <w:shd w:fill="F5FAFF" w:val="clear"/>
+            <w:tcMar>
+              <w:top w:type="dxa" w:w="100"/>
+              <w:left w:type="dxa" w:w="140"/>
+              <w:bottom w:type="dxa" w:w="100"/>
+              <w:right w:type="dxa" w:w="140"/>
+            </w:tcMar>
+            <w:vAlign w:val="top"/>
+          </w:tcPr>
+          <w:p>
+            <w:pPr>
+              <w:spacing w:after="80" w:before="80"/>
+              <w:jc w:val="left"/>
+            </w:pPr>
+            <w:r>
+              <w:rPr>
+                <w:rFonts w:ascii="Arial" w:cs="Arial" w:eastAsia="Arial" w:hAnsi="Arial"/>
+                <w:b w:val="false"/>
+                <w:bCs w:val="false"/>
+                <w:i w:val="false"/>
+                <w:iCs w:val="false"/>
+                <w:color w:val="1A1A1A"/>
+                <w:sz w:val="20"/>
+                <w:szCs w:val="20"/>
+              </w:rPr>
+              <w:t xml:space="preserve"/>
             </w:r>
           </w:p>
         </w:tc>
@@ -3468,7 +4282,7 @@
                 <w:sz w:val="20"/>
                 <w:szCs w:val="20"/>
               </w:rPr>
-              <w:t xml:space="preserve">[[FOR e IN errors]][[$e.situation]]</w:t>
+              <w:t xml:space="preserve">[[FOR e IN errors]]</w:t>
             </w:r>
           </w:p>
         </w:tc>
@@ -3506,6 +4320,122 @@
                 <w:sz w:val="20"/>
                 <w:szCs w:val="20"/>
               </w:rPr>
+              <w:t xml:space="preserve"/>
+            </w:r>
+          </w:p>
+        </w:tc>
+        <w:tc>
+          <w:tcPr>
+            <w:tcW w:type="dxa" w:w="3360"/>
+            <w:tcBorders>
+              <w:top w:val="single" w:color="BDD7EE" w:sz="4"/>
+              <w:left w:val="single" w:color="BDD7EE" w:sz="4"/>
+              <w:bottom w:val="single" w:color="BDD7EE" w:sz="4"/>
+              <w:right w:val="single" w:color="BDD7EE" w:sz="4"/>
+            </w:tcBorders>
+            <w:shd w:fill="FFFFFF" w:val="clear"/>
+            <w:tcMar>
+              <w:top w:type="dxa" w:w="100"/>
+              <w:left w:type="dxa" w:w="140"/>
+              <w:bottom w:type="dxa" w:w="100"/>
+              <w:right w:type="dxa" w:w="140"/>
+            </w:tcMar>
+            <w:vAlign w:val="top"/>
+          </w:tcPr>
+          <w:p>
+            <w:pPr>
+              <w:spacing w:after="80" w:before="80"/>
+              <w:jc w:val="left"/>
+            </w:pPr>
+            <w:r>
+              <w:rPr>
+                <w:rFonts w:ascii="Arial" w:cs="Arial" w:eastAsia="Arial" w:hAnsi="Arial"/>
+                <w:b w:val="false"/>
+                <w:bCs w:val="false"/>
+                <w:i w:val="false"/>
+                <w:iCs w:val="false"/>
+                <w:color w:val="1A1A1A"/>
+                <w:sz w:val="20"/>
+                <w:szCs w:val="20"/>
+              </w:rPr>
+              <w:t xml:space="preserve"/>
+            </w:r>
+          </w:p>
+        </w:tc>
+      </w:tr>
+      <w:tr>
+        <w:tc>
+          <w:tcPr>
+            <w:tcW w:type="dxa" w:w="2800"/>
+            <w:tcBorders>
+              <w:top w:val="single" w:color="BDD7EE" w:sz="4"/>
+              <w:left w:val="single" w:color="BDD7EE" w:sz="4"/>
+              <w:bottom w:val="single" w:color="BDD7EE" w:sz="4"/>
+              <w:right w:val="single" w:color="BDD7EE" w:sz="4"/>
+            </w:tcBorders>
+            <w:shd w:fill="FFFFFF" w:val="clear"/>
+            <w:tcMar>
+              <w:top w:type="dxa" w:w="100"/>
+              <w:left w:type="dxa" w:w="140"/>
+              <w:bottom w:type="dxa" w:w="100"/>
+              <w:right w:type="dxa" w:w="140"/>
+            </w:tcMar>
+            <w:vAlign w:val="top"/>
+          </w:tcPr>
+          <w:p>
+            <w:pPr>
+              <w:spacing w:after="80" w:before="80"/>
+              <w:jc w:val="left"/>
+            </w:pPr>
+            <w:r>
+              <w:rPr>
+                <w:rFonts w:ascii="Arial" w:cs="Arial" w:eastAsia="Arial" w:hAnsi="Arial"/>
+                <w:b w:val="false"/>
+                <w:bCs w:val="false"/>
+                <w:i w:val="false"/>
+                <w:iCs w:val="false"/>
+                <w:color w:val="1A1A1A"/>
+                <w:sz w:val="20"/>
+                <w:szCs w:val="20"/>
+              </w:rPr>
+              <w:t xml:space="preserve">[[$e.situation]]</w:t>
+            </w:r>
+          </w:p>
+        </w:tc>
+        <w:tc>
+          <w:tcPr>
+            <w:tcW w:type="dxa" w:w="3200"/>
+            <w:tcBorders>
+              <w:top w:val="single" w:color="BDD7EE" w:sz="4"/>
+              <w:left w:val="single" w:color="BDD7EE" w:sz="4"/>
+              <w:bottom w:val="single" w:color="BDD7EE" w:sz="4"/>
+              <w:right w:val="single" w:color="BDD7EE" w:sz="4"/>
+            </w:tcBorders>
+            <w:shd w:fill="FFFFFF" w:val="clear"/>
+            <w:tcMar>
+              <w:top w:type="dxa" w:w="100"/>
+              <w:left w:type="dxa" w:w="140"/>
+              <w:bottom w:type="dxa" w:w="100"/>
+              <w:right w:type="dxa" w:w="140"/>
+            </w:tcMar>
+            <w:vAlign w:val="top"/>
+          </w:tcPr>
+          <w:p>
+            <w:pPr>
+              <w:spacing w:after="80" w:before="80"/>
+              <w:jc w:val="left"/>
+            </w:pPr>
+            <w:r>
+              <w:rPr>
+                <w:rFonts w:ascii="Arial" w:cs="Arial" w:eastAsia="Arial" w:hAnsi="Arial"/>
+                <w:b w:val="false"/>
+                <w:bCs w:val="false"/>
+                <w:i w:val="false"/>
+                <w:iCs w:val="false"/>
+                <w:color w:val="1A1A1A"/>
+                <w:sz w:val="20"/>
+                <w:szCs w:val="20"/>
+              </w:rPr>
               <w:t xml:space="preserve">[[$e.message]]</w:t>
             </w:r>
           </w:p>
@@ -3544,7 +4474,123 @@
                 <w:sz w:val="20"/>
                 <w:szCs w:val="20"/>
               </w:rPr>
-              <w:t xml:space="preserve">[[$e.action]][[END-FOR e]]</w:t>
+              <w:t xml:space="preserve">[[$e.action]]</w:t>
+            </w:r>
+          </w:p>
+        </w:tc>
+      </w:tr>
+      <w:tr>
+        <w:tc>
+          <w:tcPr>
+            <w:tcW w:type="dxa" w:w="2800"/>
+            <w:tcBorders>
+              <w:top w:val="single" w:color="BDD7EE" w:sz="4"/>
+              <w:left w:val="single" w:color="BDD7EE" w:sz="4"/>
+              <w:bottom w:val="single" w:color="BDD7EE" w:sz="4"/>
+              <w:right w:val="single" w:color="BDD7EE" w:sz="4"/>
+            </w:tcBorders>
+            <w:shd w:fill="FFFFFF" w:val="clear"/>
+            <w:tcMar>
+              <w:top w:type="dxa" w:w="100"/>
+              <w:left w:type="dxa" w:w="140"/>
+              <w:bottom w:type="dxa" w:w="100"/>
+              <w:right w:type="dxa" w:w="140"/>
+            </w:tcMar>
+            <w:vAlign w:val="top"/>
+          </w:tcPr>
+          <w:p>
+            <w:pPr>
+              <w:spacing w:after="80" w:before="80"/>
+              <w:jc w:val="left"/>
+            </w:pPr>
+            <w:r>
+              <w:rPr>
+                <w:rFonts w:ascii="Arial" w:cs="Arial" w:eastAsia="Arial" w:hAnsi="Arial"/>
+                <w:b w:val="false"/>
+                <w:bCs w:val="false"/>
+                <w:i w:val="false"/>
+                <w:iCs w:val="false"/>
+                <w:color w:val="1A1A1A"/>
+                <w:sz w:val="20"/>
+                <w:szCs w:val="20"/>
+              </w:rPr>
+              <w:t xml:space="preserve">[[END-FOR e]]</w:t>
+            </w:r>
+          </w:p>
+        </w:tc>
+        <w:tc>
+          <w:tcPr>
+            <w:tcW w:type="dxa" w:w="3200"/>
+            <w:tcBorders>
+              <w:top w:val="single" w:color="BDD7EE" w:sz="4"/>
+              <w:left w:val="single" w:color="BDD7EE" w:sz="4"/>
+              <w:bottom w:val="single" w:color="BDD7EE" w:sz="4"/>
+              <w:right w:val="single" w:color="BDD7EE" w:sz="4"/>
+            </w:tcBorders>
+            <w:shd w:fill="FFFFFF" w:val="clear"/>
+            <w:tcMar>
+              <w:top w:type="dxa" w:w="100"/>
+              <w:left w:type="dxa" w:w="140"/>
+              <w:bottom w:type="dxa" w:w="100"/>
+              <w:right w:type="dxa" w:w="140"/>
+            </w:tcMar>
+            <w:vAlign w:val="top"/>
+          </w:tcPr>
+          <w:p>
+            <w:pPr>
+              <w:spacing w:after="80" w:before="80"/>
+              <w:jc w:val="left"/>
+            </w:pPr>
+            <w:r>
+              <w:rPr>
+                <w:rFonts w:ascii="Arial" w:cs="Arial" w:eastAsia="Arial" w:hAnsi="Arial"/>
+                <w:b w:val="false"/>
+                <w:bCs w:val="false"/>
+                <w:i w:val="false"/>
+                <w:iCs w:val="false"/>
+                <w:color w:val="1A1A1A"/>
+                <w:sz w:val="20"/>
+                <w:szCs w:val="20"/>
+              </w:rPr>
+              <w:t xml:space="preserve"/>
+            </w:r>
+          </w:p>
+        </w:tc>
+        <w:tc>
+          <w:tcPr>
+            <w:tcW w:type="dxa" w:w="3360"/>
+            <w:tcBorders>
+              <w:top w:val="single" w:color="BDD7EE" w:sz="4"/>
+              <w:left w:val="single" w:color="BDD7EE" w:sz="4"/>
+              <w:bottom w:val="single" w:color="BDD7EE" w:sz="4"/>
+              <w:right w:val="single" w:color="BDD7EE" w:sz="4"/>
+            </w:tcBorders>
+            <w:shd w:fill="FFFFFF" w:val="clear"/>
+            <w:tcMar>
+              <w:top w:type="dxa" w:w="100"/>
+              <w:left w:type="dxa" w:w="140"/>
+              <w:bottom w:type="dxa" w:w="100"/>
+              <w:right w:type="dxa" w:w="140"/>
+            </w:tcMar>
+            <w:vAlign w:val="top"/>
+          </w:tcPr>
+          <w:p>
+            <w:pPr>
+              <w:spacing w:after="80" w:before="80"/>
+              <w:jc w:val="left"/>
+            </w:pPr>
+            <w:r>
+              <w:rPr>
+                <w:rFonts w:ascii="Arial" w:cs="Arial" w:eastAsia="Arial" w:hAnsi="Arial"/>
+                <w:b w:val="false"/>
+                <w:bCs w:val="false"/>
+                <w:i w:val="false"/>
+                <w:iCs w:val="false"/>
+                <w:color w:val="1A1A1A"/>
+                <w:sz w:val="20"/>
+                <w:szCs w:val="20"/>
+              </w:rPr>
+              <w:t xml:space="preserve"/>
             </w:r>
           </w:p>
         </w:tc>
@@ -3600,7 +4646,53 @@
           <w:sz w:val="20"/>
           <w:szCs w:val="20"/>
         </w:rPr>
-        <w:t xml:space="preserve">[[FOR br IN businessRules]][[$br]][[END-FOR br]]</w:t>
+        <w:t xml:space="preserve">[[FOR br IN businessRules]]</w:t>
+      </w:r>
+    </w:p>
+    <w:p>
+      <w:pPr>
+        <w:pStyle w:val="ListParagraph"/>
+        <w:numPr>
+          <w:ilvl w:val="0"/>
+          <w:numId w:val="2"/>
+        </w:numPr>
+        <w:spacing w:after="60" w:before="60"/>
+      </w:pPr>
+      <w:r>
+        <w:rPr>
+          <w:rFonts w:ascii="Arial" w:cs="Arial" w:eastAsia="Arial" w:hAnsi="Arial"/>
+          <w:b w:val="false"/>
+          <w:bCs w:val="false"/>
+          <w:i w:val="false"/>
+          <w:iCs w:val="false"/>
+          <w:color w:val="1A1A1A"/>
+          <w:sz w:val="20"/>
+          <w:szCs w:val="20"/>
+        </w:rPr>
+        <w:t xml:space="preserve">[[$br]]</w:t>
+      </w:r>
+    </w:p>
+    <w:p>
+      <w:pPr>
+        <w:pStyle w:val="ListParagraph"/>
+        <w:numPr>
+          <w:ilvl w:val="0"/>
+          <w:numId w:val="2"/>
+        </w:numPr>
+        <w:spacing w:after="60" w:before="60"/>
+      </w:pPr>
+      <w:r>
+        <w:rPr>
+          <w:rFonts w:ascii="Arial" w:cs="Arial" w:eastAsia="Arial" w:hAnsi="Arial"/>
+          <w:b w:val="false"/>
+          <w:bCs w:val="false"/>
+          <w:i w:val="false"/>
+          <w:iCs w:val="false"/>
+          <w:color w:val="1A1A1A"/>
+          <w:sz w:val="20"/>
+          <w:szCs w:val="20"/>
+        </w:rPr>
+        <w:t xml:space="preserve">[[END-FOR br]]</w:t>
       </w:r>
     </w:p>
     <w:p>
@@ -3882,7 +4974,7 @@
                 <w:sz w:val="20"/>
                 <w:szCs w:val="20"/>
               </w:rPr>
-              <w:t xml:space="preserve">[[FOR q IN openQuestions]][[$q.stt]]</w:t>
+              <w:t xml:space="preserve">[[FOR q IN openQuestions]]</w:t>
             </w:r>
           </w:p>
         </w:tc>
@@ -3920,6 +5012,198 @@
                 <w:sz w:val="20"/>
                 <w:szCs w:val="20"/>
               </w:rPr>
+              <w:t xml:space="preserve"/>
+            </w:r>
+          </w:p>
+        </w:tc>
+        <w:tc>
+          <w:tcPr>
+            <w:tcW w:type="dxa" w:w="3800"/>
+            <w:tcBorders>
+              <w:top w:val="single" w:color="BDD7EE" w:sz="4"/>
+              <w:left w:val="single" w:color="BDD7EE" w:sz="4"/>
+              <w:bottom w:val="single" w:color="BDD7EE" w:sz="4"/>
+              <w:right w:val="single" w:color="BDD7EE" w:sz="4"/>
+            </w:tcBorders>
+            <w:shd w:fill="FFFFFF" w:val="clear"/>
+            <w:tcMar>
+              <w:top w:type="dxa" w:w="100"/>
+              <w:left w:type="dxa" w:w="140"/>
+              <w:bottom w:type="dxa" w:w="100"/>
+              <w:right w:type="dxa" w:w="140"/>
+            </w:tcMar>
+            <w:vAlign w:val="top"/>
+          </w:tcPr>
+          <w:p>
+            <w:pPr>
+              <w:spacing w:after="80" w:before="80"/>
+              <w:jc w:val="left"/>
+            </w:pPr>
+            <w:r>
+              <w:rPr>
+                <w:rFonts w:ascii="Arial" w:cs="Arial" w:eastAsia="Arial" w:hAnsi="Arial"/>
+                <w:b w:val="false"/>
+                <w:bCs w:val="false"/>
+                <w:i w:val="false"/>
+                <w:iCs w:val="false"/>
+                <w:color w:val="1A1A1A"/>
+                <w:sz w:val="20"/>
+                <w:szCs w:val="20"/>
+              </w:rPr>
+              <w:t xml:space="preserve"/>
+            </w:r>
+          </w:p>
+        </w:tc>
+        <w:tc>
+          <w:tcPr>
+            <w:tcW w:type="dxa" w:w="1560"/>
+            <w:tcBorders>
+              <w:top w:val="single" w:color="BDD7EE" w:sz="4"/>
+              <w:left w:val="single" w:color="BDD7EE" w:sz="4"/>
+              <w:bottom w:val="single" w:color="BDD7EE" w:sz="4"/>
+              <w:right w:val="single" w:color="BDD7EE" w:sz="4"/>
+            </w:tcBorders>
+            <w:shd w:fill="FFFFFF" w:val="clear"/>
+            <w:tcMar>
+              <w:top w:type="dxa" w:w="100"/>
+              <w:left w:type="dxa" w:w="140"/>
+              <w:bottom w:type="dxa" w:w="100"/>
+              <w:right w:type="dxa" w:w="140"/>
+            </w:tcMar>
+            <w:vAlign w:val="top"/>
+          </w:tcPr>
+          <w:p>
+            <w:pPr>
+              <w:spacing w:after="80" w:before="80"/>
+              <w:jc w:val="left"/>
+            </w:pPr>
+            <w:r>
+              <w:rPr>
+                <w:rFonts w:ascii="Arial" w:cs="Arial" w:eastAsia="Arial" w:hAnsi="Arial"/>
+                <w:b w:val="false"/>
+                <w:bCs w:val="false"/>
+                <w:i w:val="false"/>
+                <w:iCs w:val="false"/>
+                <w:color w:val="1A1A1A"/>
+                <w:sz w:val="20"/>
+                <w:szCs w:val="20"/>
+              </w:rPr>
+              <w:t xml:space="preserve"/>
+            </w:r>
+          </w:p>
+        </w:tc>
+        <w:tc>
+          <w:tcPr>
+            <w:tcW w:type="dxa" w:w="1300"/>
+            <w:tcBorders>
+              <w:top w:val="single" w:color="BDD7EE" w:sz="4"/>
+              <w:left w:val="single" w:color="BDD7EE" w:sz="4"/>
+              <w:bottom w:val="single" w:color="BDD7EE" w:sz="4"/>
+              <w:right w:val="single" w:color="BDD7EE" w:sz="4"/>
+            </w:tcBorders>
+            <w:shd w:fill="FFFFFF" w:val="clear"/>
+            <w:tcMar>
+              <w:top w:type="dxa" w:w="100"/>
+              <w:left w:type="dxa" w:w="140"/>
+              <w:bottom w:type="dxa" w:w="100"/>
+              <w:right w:type="dxa" w:w="140"/>
+            </w:tcMar>
+            <w:vAlign w:val="top"/>
+          </w:tcPr>
+          <w:p>
+            <w:pPr>
+              <w:spacing w:after="80" w:before="80"/>
+              <w:jc w:val="left"/>
+            </w:pPr>
+            <w:r>
+              <w:rPr>
+                <w:rFonts w:ascii="Arial" w:cs="Arial" w:eastAsia="Arial" w:hAnsi="Arial"/>
+                <w:b w:val="false"/>
+                <w:bCs w:val="false"/>
+                <w:i w:val="false"/>
+                <w:iCs w:val="false"/>
+                <w:color w:val="1A1A1A"/>
+                <w:sz w:val="20"/>
+                <w:szCs w:val="20"/>
+              </w:rPr>
+              <w:t xml:space="preserve"/>
+            </w:r>
+          </w:p>
+        </w:tc>
+      </w:tr>
+      <w:tr>
+        <w:tc>
+          <w:tcPr>
+            <w:tcW w:type="dxa" w:w="500"/>
+            <w:tcBorders>
+              <w:top w:val="single" w:color="BDD7EE" w:sz="4"/>
+              <w:left w:val="single" w:color="BDD7EE" w:sz="4"/>
+              <w:bottom w:val="single" w:color="BDD7EE" w:sz="4"/>
+              <w:right w:val="single" w:color="BDD7EE" w:sz="4"/>
+            </w:tcBorders>
+            <w:shd w:fill="FFFFFF" w:val="clear"/>
+            <w:tcMar>
+              <w:top w:type="dxa" w:w="100"/>
+              <w:left w:type="dxa" w:w="140"/>
+              <w:bottom w:type="dxa" w:w="100"/>
+              <w:right w:type="dxa" w:w="140"/>
+            </w:tcMar>
+            <w:vAlign w:val="top"/>
+          </w:tcPr>
+          <w:p>
+            <w:pPr>
+              <w:spacing w:after="80" w:before="80"/>
+              <w:jc w:val="left"/>
+            </w:pPr>
+            <w:r>
+              <w:rPr>
+                <w:rFonts w:ascii="Arial" w:cs="Arial" w:eastAsia="Arial" w:hAnsi="Arial"/>
+                <w:b w:val="false"/>
+                <w:bCs w:val="false"/>
+                <w:i w:val="false"/>
+                <w:iCs w:val="false"/>
+                <w:color w:val="1A1A1A"/>
+                <w:sz w:val="20"/>
+                <w:szCs w:val="20"/>
+              </w:rPr>
+              <w:t xml:space="preserve">[[$q.stt]]</w:t>
+            </w:r>
+          </w:p>
+        </w:tc>
+        <w:tc>
+          <w:tcPr>
+            <w:tcW w:type="dxa" w:w="2200"/>
+            <w:tcBorders>
+              <w:top w:val="single" w:color="BDD7EE" w:sz="4"/>
+              <w:left w:val="single" w:color="BDD7EE" w:sz="4"/>
+              <w:bottom w:val="single" w:color="BDD7EE" w:sz="4"/>
+              <w:right w:val="single" w:color="BDD7EE" w:sz="4"/>
+            </w:tcBorders>
+            <w:shd w:fill="FFFFFF" w:val="clear"/>
+            <w:tcMar>
+              <w:top w:type="dxa" w:w="100"/>
+              <w:left w:type="dxa" w:w="140"/>
+              <w:bottom w:type="dxa" w:w="100"/>
+              <w:right w:type="dxa" w:w="140"/>
+            </w:tcMar>
+            <w:vAlign w:val="top"/>
+          </w:tcPr>
+          <w:p>
+            <w:pPr>
+              <w:spacing w:after="80" w:before="80"/>
+              <w:jc w:val="left"/>
+            </w:pPr>
+            <w:r>
+              <w:rPr>
+                <w:rFonts w:ascii="Arial" w:cs="Arial" w:eastAsia="Arial" w:hAnsi="Arial"/>
+                <w:b w:val="false"/>
+                <w:bCs w:val="false"/>
+                <w:i w:val="false"/>
+                <w:iCs w:val="false"/>
+                <w:color w:val="1A1A1A"/>
+                <w:sz w:val="20"/>
+                <w:szCs w:val="20"/>
+              </w:rPr>
               <w:t xml:space="preserve">[[$q.topic]]</w:t>
             </w:r>
           </w:p>
@@ -4034,7 +5318,199 @@
                 <w:sz w:val="20"/>
                 <w:szCs w:val="20"/>
               </w:rPr>
-              <w:t xml:space="preserve">[[$q.status]][[END-FOR q]]</w:t>
+              <w:t xml:space="preserve">[[$q.status]]</w:t>
+            </w:r>
+          </w:p>
+        </w:tc>
+      </w:tr>
+      <w:tr>
+        <w:tc>
+          <w:tcPr>
+            <w:tcW w:type="dxa" w:w="500"/>
+            <w:tcBorders>
+              <w:top w:val="single" w:color="BDD7EE" w:sz="4"/>
+              <w:left w:val="single" w:color="BDD7EE" w:sz="4"/>
+              <w:bottom w:val="single" w:color="BDD7EE" w:sz="4"/>
+              <w:right w:val="single" w:color="BDD7EE" w:sz="4"/>
+            </w:tcBorders>
+            <w:shd w:fill="FFFFFF" w:val="clear"/>
+            <w:tcMar>
+              <w:top w:type="dxa" w:w="100"/>
+              <w:left w:type="dxa" w:w="140"/>
+              <w:bottom w:type="dxa" w:w="100"/>
+              <w:right w:type="dxa" w:w="140"/>
+            </w:tcMar>
+            <w:vAlign w:val="top"/>
+          </w:tcPr>
+          <w:p>
+            <w:pPr>
+              <w:spacing w:after="80" w:before="80"/>
+              <w:jc w:val="left"/>
+            </w:pPr>
+            <w:r>
+              <w:rPr>
+                <w:rFonts w:ascii="Arial" w:cs="Arial" w:eastAsia="Arial" w:hAnsi="Arial"/>
+                <w:b w:val="false"/>
+                <w:bCs w:val="false"/>
+                <w:i w:val="false"/>
+                <w:iCs w:val="false"/>
+                <w:color w:val="1A1A1A"/>
+                <w:sz w:val="20"/>
+                <w:szCs w:val="20"/>
+              </w:rPr>
+              <w:t xml:space="preserve">[[END-FOR q]]</w:t>
+            </w:r>
+          </w:p>
+        </w:tc>
+        <w:tc>
+          <w:tcPr>
+            <w:tcW w:type="dxa" w:w="2200"/>
+            <w:tcBorders>
+              <w:top w:val="single" w:color="BDD7EE" w:sz="4"/>
+              <w:left w:val="single" w:color="BDD7EE" w:sz="4"/>
+              <w:bottom w:val="single" w:color="BDD7EE" w:sz="4"/>
+              <w:right w:val="single" w:color="BDD7EE" w:sz="4"/>
+            </w:tcBorders>
+            <w:shd w:fill="FFFFFF" w:val="clear"/>
+            <w:tcMar>
+              <w:top w:type="dxa" w:w="100"/>
+              <w:left w:type="dxa" w:w="140"/>
+              <w:bottom w:type="dxa" w:w="100"/>
+              <w:right w:type="dxa" w:w="140"/>
+            </w:tcMar>
+            <w:vAlign w:val="top"/>
+          </w:tcPr>
+          <w:p>
+            <w:pPr>
+              <w:spacing w:after="80" w:before="80"/>
+              <w:jc w:val="left"/>
+            </w:pPr>
+            <w:r>
+              <w:rPr>
+                <w:rFonts w:ascii="Arial" w:cs="Arial" w:eastAsia="Arial" w:hAnsi="Arial"/>
+                <w:b w:val="false"/>
+                <w:bCs w:val="false"/>
+                <w:i w:val="false"/>
+                <w:iCs w:val="false"/>
+                <w:color w:val="1A1A1A"/>
+                <w:sz w:val="20"/>
+                <w:szCs w:val="20"/>
+              </w:rPr>
+              <w:t xml:space="preserve"/>
+            </w:r>
+          </w:p>
+        </w:tc>
+        <w:tc>
+          <w:tcPr>
+            <w:tcW w:type="dxa" w:w="3800"/>
+            <w:tcBorders>
+              <w:top w:val="single" w:color="BDD7EE" w:sz="4"/>
+              <w:left w:val="single" w:color="BDD7EE" w:sz="4"/>
+              <w:bottom w:val="single" w:color="BDD7EE" w:sz="4"/>
+              <w:right w:val="single" w:color="BDD7EE" w:sz="4"/>
+            </w:tcBorders>
+            <w:shd w:fill="FFFFFF" w:val="clear"/>
+            <w:tcMar>
+              <w:top w:type="dxa" w:w="100"/>
+              <w:left w:type="dxa" w:w="140"/>
+              <w:bottom w:type="dxa" w:w="100"/>
+              <w:right w:type="dxa" w:w="140"/>
+            </w:tcMar>
+            <w:vAlign w:val="top"/>
+          </w:tcPr>
+          <w:p>
+            <w:pPr>
+              <w:spacing w:after="80" w:before="80"/>
+              <w:jc w:val="left"/>
+            </w:pPr>
+            <w:r>
+              <w:rPr>
+                <w:rFonts w:ascii="Arial" w:cs="Arial" w:eastAsia="Arial" w:hAnsi="Arial"/>
+                <w:b w:val="false"/>
+                <w:bCs w:val="false"/>
+                <w:i w:val="false"/>
+                <w:iCs w:val="false"/>
+                <w:color w:val="1A1A1A"/>
+                <w:sz w:val="20"/>
+                <w:szCs w:val="20"/>
+              </w:rPr>
+              <w:t xml:space="preserve"/>
+            </w:r>
+          </w:p>
+        </w:tc>
+        <w:tc>
+          <w:tcPr>
+            <w:tcW w:type="dxa" w:w="1560"/>
+            <w:tcBorders>
+              <w:top w:val="single" w:color="BDD7EE" w:sz="4"/>
+              <w:left w:val="single" w:color="BDD7EE" w:sz="4"/>
+              <w:bottom w:val="single" w:color="BDD7EE" w:sz="4"/>
+              <w:right w:val="single" w:color="BDD7EE" w:sz="4"/>
+            </w:tcBorders>
+            <w:shd w:fill="FFFFFF" w:val="clear"/>
+            <w:tcMar>
+              <w:top w:type="dxa" w:w="100"/>
+              <w:left w:type="dxa" w:w="140"/>
+              <w:bottom w:type="dxa" w:w="100"/>
+              <w:right w:type="dxa" w:w="140"/>
+            </w:tcMar>
+            <w:vAlign w:val="top"/>
+          </w:tcPr>
+          <w:p>
+            <w:pPr>
+              <w:spacing w:after="80" w:before="80"/>
+              <w:jc w:val="left"/>
+            </w:pPr>
+            <w:r>
+              <w:rPr>
+                <w:rFonts w:ascii="Arial" w:cs="Arial" w:eastAsia="Arial" w:hAnsi="Arial"/>
+                <w:b w:val="false"/>
+                <w:bCs w:val="false"/>
+                <w:i w:val="false"/>
+                <w:iCs w:val="false"/>
+                <w:color w:val="1A1A1A"/>
+                <w:sz w:val="20"/>
+                <w:szCs w:val="20"/>
+              </w:rPr>
+              <w:t xml:space="preserve"/>
+            </w:r>
+          </w:p>
+        </w:tc>
+        <w:tc>
+          <w:tcPr>
+            <w:tcW w:type="dxa" w:w="1300"/>
+            <w:tcBorders>
+              <w:top w:val="single" w:color="BDD7EE" w:sz="4"/>
+              <w:left w:val="single" w:color="BDD7EE" w:sz="4"/>
+              <w:bottom w:val="single" w:color="BDD7EE" w:sz="4"/>
+              <w:right w:val="single" w:color="BDD7EE" w:sz="4"/>
+            </w:tcBorders>
+            <w:shd w:fill="FFFFFF" w:val="clear"/>
+            <w:tcMar>
+              <w:top w:type="dxa" w:w="100"/>
+              <w:left w:type="dxa" w:w="140"/>
+              <w:bottom w:type="dxa" w:w="100"/>
+              <w:right w:type="dxa" w:w="140"/>
+            </w:tcMar>
+            <w:vAlign w:val="top"/>
+          </w:tcPr>
+          <w:p>
+            <w:pPr>
+              <w:spacing w:after="80" w:before="80"/>
+              <w:jc w:val="left"/>
+            </w:pPr>
+            <w:r>
+              <w:rPr>
+                <w:rFonts w:ascii="Arial" w:cs="Arial" w:eastAsia="Arial" w:hAnsi="Arial"/>
+                <w:b w:val="false"/>
+                <w:bCs w:val="false"/>
+                <w:i w:val="false"/>
+                <w:iCs w:val="false"/>
+                <w:color w:val="1A1A1A"/>
+                <w:sz w:val="20"/>
+                <w:szCs w:val="20"/>
+              </w:rPr>
+              <w:t xml:space="preserve"/>
             </w:r>
           </w:p>
         </w:tc>

</xml_diff>